<commit_message>
v20.6: SW network-first HTML — 재방문 사용자 항상 최신 버전
원인: v20.4 의 sw.js 가 cache-first 라 사용자 브라우저가 옛 index.html 계속 캐시. Playwright 는 매번 새 컨텍스트라 못 잡음.

수정:
- sw.js: HTML 은 network-first (캐시는 fallback), 그 외만 cache-first
- SW 업데이트 감지 → controllerchange 시 1회 자동 새로고침
- 시간당 1회 reg.update() 자동 호출
- 자체 테스트 #70-pre: 동일 컨텍스트에서 두 번 방문해도 같은 버전(최신) 확인 — 이런 버그 다시 안 새도록 영구 등록
</commit_message>
<xml_diff>
--- a/test/out_safari/saved_Chromium 모바일.docx
+++ b/test/out_safari/saved_Chromium 모바일.docx
@@ -4,17 +4,7 @@
   <w:body>
     <w:p>
       <w:r>
-        <w:t xml:space="preserve">안녕하세요 hello world</w:t>
-      </w:r>
-    </w:p>
-    <w:p>
-      <w:r>
-        <w:t xml:space="preserve"/>
-      </w:r>
-    </w:p>
-    <w:p>
-      <w:r>
-        <w:t xml:space="preserve"/>
+        <w:t xml:space="preserve">새 문서안녕하세요 hello world</w:t>
       </w:r>
     </w:p>
     <w:sectPr>

</xml_diff>